<commit_message>
Sync current engineering review and UI state; add hosted MarkItDown conversion
</commit_message>
<xml_diff>
--- a/01_Concept_Architecture.docx
+++ b/01_Concept_Architecture.docx
@@ -7,7 +7,10 @@
         <w:pStyle w:val="Title"/>
       </w:pPr>
       <w:r>
-        <w:t>01  |  Concept design &amp; architecture</w:t>
+        <w:rPr>
+          <w:color w:val="000000"/>
+        </w:rPr>
+        <w:t>MotoMedic AI concept and architecture</w:t>
       </w:r>
     </w:p>
     <w:p>
@@ -15,6 +18,9 @@
         <w:pStyle w:val="Subtitle"/>
       </w:pPr>
       <w:r>
+        <w:rPr>
+          <w:color w:val="000000"/>
+        </w:rPr>
         <w:t>Evidence-grounded, multimodal and adaptive motorcycle troubleshooting</w:t>
       </w:r>
     </w:p>
@@ -25,7 +31,13 @@
           <w:color w:val="B5631D"/>
           <w:sz w:val="17"/>
         </w:rPr>
-        <w:t>DRAFT  v0.2    •    Owner-manual prototype; independent review and variant fit pending</w:t>
+        <w:t>v0.3  Refreshed 9 October 2026  Aligned to TRD v0.4</w:t>
+      </w:r>
+    </w:p>
+    <w:p>
+      <w:pPr/>
+      <w:r>
+        <w:t>TRD v0.4 is the authoritative design and technical contract as of 9 October 2026. This document follows it. The approved owner manual governs motorcycle facts; source applicability, rights, independent review and release gates remain mandatory. Recorded implementation progress does not constitute release approval.</w:t>
       </w:r>
     </w:p>
     <w:p>
@@ -33,6 +45,9 @@
         <w:pStyle w:val="Heading1"/>
       </w:pPr>
       <w:r>
+        <w:rPr>
+          <w:color w:val="000000"/>
+        </w:rPr>
         <w:t>Executive concept</w:t>
       </w:r>
     </w:p>
@@ -41,35 +56,11 @@
         <w:t>MotoMedic AI is a shareable assistant for an identified motorcycle model and a versioned Royal Enfield New Himalayan 450 owner's manual. Users may describe a symptom in text, upload a motorcycle photo, or optionally dictate a voice message. The assistant retrieves and composes only manual-supported advice, cites the relevant pages, and explicitly escalates to OEM support when evidence is unavailable.</w:t>
       </w:r>
     </w:p>
-    <w:tbl>
-      <w:tblPr>
-        <w:tblW w:type="auto" w:w="0"/>
-        <w:tblLook w:firstColumn="1" w:firstRow="1" w:lastColumn="0" w:lastRow="0" w:noHBand="0" w:noVBand="1" w:val="04A0"/>
-      </w:tblPr>
-      <w:tblGrid>
-        <w:gridCol w:w="10022"/>
-      </w:tblGrid>
-      <w:tr>
-        <w:tc>
-          <w:tcPr>
-            <w:tcW w:type="dxa" w:w="10022"/>
-            <w:shd w:fill="EAF3F7"/>
-          </w:tcPr>
-          <w:p>
-            <w:r>
-              <w:rPr>
-                <w:b/>
-                <w:color w:val="1766A5"/>
-              </w:rPr>
-              <w:t xml:space="preserve">Product thesis  </w:t>
-            </w:r>
-            <w:r>
-              <w:t>The retrieval system locates evidence; a diagnostic state machine chooses the next eligible documented action; a fail-closed release gate prevents unsupported technical instructions from reaching the customer.</w:t>
-            </w:r>
-          </w:p>
-        </w:tc>
-      </w:tr>
-    </w:tbl>
+    <w:p>
+      <w:r>
+        <w:t>Product thesis  The retrieval system locates evidence; a diagnostic state machine chooses the next eligible documented action; a fail-closed release gate prevents unsupported technical instructions from reaching the customer.</w:t>
+      </w:r>
+    </w:p>
     <w:p>
       <w:pPr>
         <w:spacing w:after="0"/>
@@ -80,6 +71,9 @@
         <w:pStyle w:val="Heading1"/>
       </w:pPr>
       <w:r>
+        <w:rPr>
+          <w:color w:val="000000"/>
+        </w:rPr>
         <w:t>User promise and boundaries</w:t>
       </w:r>
     </w:p>
@@ -303,6 +297,9 @@
         <w:pStyle w:val="Heading1"/>
       </w:pPr>
       <w:r>
+        <w:rPr>
+          <w:color w:val="000000"/>
+        </w:rPr>
         <w:t>End-to-end logical architecture</w:t>
       </w:r>
     </w:p>
@@ -313,7 +310,7 @@
       <w:r>
         <w:drawing>
           <wp:inline xmlns:a="http://schemas.openxmlformats.org/drawingml/2006/main" xmlns:pic="http://schemas.openxmlformats.org/drawingml/2006/picture">
-            <wp:extent cx="6080760" cy="4645629"/>
+            <wp:extent cx="6080760" cy="6013196"/>
             <wp:docPr id="1" name="Picture 1"/>
             <wp:cNvGraphicFramePr>
               <a:graphicFrameLocks noChangeAspect="1"/>
@@ -334,7 +331,7 @@
                   <pic:spPr>
                     <a:xfrm>
                       <a:off x="0" y="0"/>
-                      <a:ext cx="6080760" cy="4645629"/>
+                      <a:ext cx="6080760" cy="6013196"/>
                     </a:xfrm>
                     <a:prstGeom prst="rect"/>
                   </pic:spPr>
@@ -347,7 +344,7 @@
     </w:p>
     <w:p>
       <w:r>
-        <w:t>Two pipelines keep runtime fast: document parsing, enrichment, indexing and explicit relationship extraction occur offline. Online processing interprets customer observations, uses dense+sparse retrieval and graph-linked evidence, then conditionally generates a verified answer. Every output is accompanied by session-state updates and telemetry.</w:t>
+        <w:t>Both build and runtime are hosted. Versioned ingestion parses, chunks and embeds the approved owner manual before rider requests; runtime reuses the immutable dense/BM25 index and reviewed source relationships. Retrieval assembles candidates, bounded recovery and conditional reranking resolve retrieval uncertainty, the controller selects an eligible documented step, and deterministic plus semantic validation gates the final response. The diagrams show the target contracts; current progress is recorded below.</w:t>
       </w:r>
     </w:p>
     <w:p>
@@ -355,6 +352,9 @@
         <w:pStyle w:val="Heading1"/>
       </w:pPr>
       <w:r>
+        <w:rPr>
+          <w:color w:val="000000"/>
+        </w:rPr>
         <w:t>Adaptive troubleshooting: what happens after feedback?</w:t>
       </w:r>
     </w:p>
@@ -370,7 +370,7 @@
       <w:r>
         <w:drawing>
           <wp:inline xmlns:a="http://schemas.openxmlformats.org/drawingml/2006/main" xmlns:pic="http://schemas.openxmlformats.org/drawingml/2006/picture">
-            <wp:extent cx="6080760" cy="3098246"/>
+            <wp:extent cx="6080760" cy="4222750"/>
             <wp:docPr id="2" name="Picture 2"/>
             <wp:cNvGraphicFramePr>
               <a:graphicFrameLocks noChangeAspect="1"/>
@@ -391,7 +391,7 @@
                   <pic:spPr>
                     <a:xfrm>
                       <a:off x="0" y="0"/>
-                      <a:ext cx="6080760" cy="3098246"/>
+                      <a:ext cx="6080760" cy="4222750"/>
                     </a:xfrm>
                     <a:prstGeom prst="rect"/>
                   </pic:spPr>
@@ -478,9 +478,6 @@
             <w:vAlign w:val="center"/>
           </w:tcPr>
           <w:p>
-            <w:pPr>
-              <w:spacing w:after="20"/>
-            </w:pPr>
             <w:r>
               <w:rPr>
                 <w:sz w:val="16"/>
@@ -495,9 +492,6 @@
             <w:vAlign w:val="center"/>
           </w:tcPr>
           <w:p>
-            <w:pPr>
-              <w:spacing w:after="20"/>
-            </w:pPr>
             <w:r>
               <w:rPr>
                 <w:sz w:val="16"/>
@@ -512,14 +506,11 @@
             <w:vAlign w:val="center"/>
           </w:tcPr>
           <w:p>
-            <w:pPr>
-              <w:spacing w:after="20"/>
-            </w:pPr>
             <w:r>
               <w:rPr>
                 <w:sz w:val="16"/>
               </w:rPr>
-              <w:t>Eliminate the documented branch that depends on an abnormal result; find an eligible alternative</w:t>
+              <w:t>Exclude only a branch whose reviewed condition is contradicted; do not infer a hidden fault or system health</w:t>
             </w:r>
           </w:p>
         </w:tc>
@@ -765,6 +756,9 @@
         <w:pStyle w:val="Heading1"/>
       </w:pPr>
       <w:r>
+        <w:rPr>
+          <w:color w:val="000000"/>
+        </w:rPr>
         <w:t>Conceptual evidence policy</w:t>
       </w:r>
     </w:p>
@@ -789,7 +783,7 @@
         <w:pStyle w:val="ListBullet"/>
       </w:pPr>
       <w:r>
-        <w:t>When evidence is partial, clarify or disclose the gap; never complete a procedure from general motorcycle knowledge</w:t>
+        <w:t>When a reviewed rider observation is missing, ask one source-derived question. Missing source objects or review are maintainer issues and block advice; never complete a procedure from general motorcycle knowledge.</w:t>
       </w:r>
     </w:p>
     <w:p>
@@ -813,6 +807,9 @@
         <w:pStyle w:val="Heading1"/>
       </w:pPr>
       <w:r>
+        <w:rPr>
+          <w:color w:val="000000"/>
+        </w:rPr>
         <w:t>Guardrails and release checks</w:t>
       </w:r>
     </w:p>
@@ -885,6 +882,9 @@
         <w:pStyle w:val="Heading1"/>
       </w:pPr>
       <w:r>
+        <w:rPr>
+          <w:color w:val="000000"/>
+        </w:rPr>
         <w:t>User-facing experience</w:t>
       </w:r>
     </w:p>
@@ -1188,6 +1188,9 @@
         <w:pStyle w:val="Heading1"/>
       </w:pPr>
       <w:r>
+        <w:rPr>
+          <w:color w:val="000000"/>
+        </w:rPr>
         <w:t>Progressive capability release</w:t>
       </w:r>
     </w:p>
@@ -1267,9 +1270,6 @@
             <w:vAlign w:val="center"/>
           </w:tcPr>
           <w:p>
-            <w:pPr>
-              <w:spacing w:after="20"/>
-            </w:pPr>
             <w:r>
               <w:rPr>
                 <w:sz w:val="16"/>
@@ -1284,14 +1284,11 @@
             <w:vAlign w:val="center"/>
           </w:tcPr>
           <w:p>
-            <w:pPr>
-              <w:spacing w:after="20"/>
-            </w:pPr>
             <w:r>
               <w:rPr>
                 <w:sz w:val="16"/>
               </w:rPr>
-              <w:t>Versioned PDF, hybrid retrieval, citations, abstention, adaptive sessions, verified source links, text and photo</w:t>
+              <w:t>Hosted index, reviewed eligibility/evidence gates, adaptive sessions, citations, text/photo, tracing and cache rejection</w:t>
             </w:r>
           </w:p>
         </w:tc>
@@ -1301,14 +1298,11 @@
             <w:vAlign w:val="center"/>
           </w:tcPr>
           <w:p>
-            <w:pPr>
-              <w:spacing w:after="20"/>
-            </w:pPr>
             <w:r>
               <w:rPr>
                 <w:sz w:val="16"/>
               </w:rPr>
-              <w:t>Manual-backed gold tests; adaptive state and source checks pass</w:t>
+              <w:t>Confirmed source/variant/rights; independently reviewed cases and all safety gates pass</w:t>
             </w:r>
           </w:p>
         </w:tc>
@@ -1324,9 +1318,6 @@
             <w:shd w:fill="F3F6FA"/>
           </w:tcPr>
           <w:p>
-            <w:pPr>
-              <w:spacing w:after="20"/>
-            </w:pPr>
             <w:r>
               <w:rPr>
                 <w:sz w:val="16"/>
@@ -1342,14 +1333,11 @@
             <w:shd w:fill="F3F6FA"/>
           </w:tcPr>
           <w:p>
-            <w:pPr>
-              <w:spacing w:after="20"/>
-            </w:pPr>
             <w:r>
               <w:rPr>
                 <w:sz w:val="16"/>
               </w:rPr>
-              <w:t>Expanded graph extraction, caching, tracing and optional voice; hosted demo remains P0</w:t>
+              <w:t>Optional voice, OEM summary and feedback; expand approved cache coverage and reviewed relationships</w:t>
             </w:r>
           </w:p>
         </w:tc>
@@ -1360,14 +1348,11 @@
             <w:shd w:fill="F3F6FA"/>
           </w:tcPr>
           <w:p>
-            <w:pPr>
-              <w:spacing w:after="20"/>
-            </w:pPr>
             <w:r>
               <w:rPr>
                 <w:sz w:val="16"/>
               </w:rPr>
-              <w:t>Multi-section evidence and performance test improvements</w:t>
+              <w:t>Measured benefit on reviewed cases; identical release gates</w:t>
             </w:r>
           </w:p>
         </w:tc>
@@ -1439,6 +1424,9 @@
         <w:pStyle w:val="Heading1"/>
       </w:pPr>
       <w:r>
+        <w:rPr>
+          <w:color w:val="000000"/>
+        </w:rPr>
         <w:t>Assumptions still to verify</w:t>
       </w:r>
     </w:p>
@@ -1447,7 +1435,7 @@
         <w:pStyle w:val="ListBullet"/>
       </w:pPr>
       <w:r>
-        <w:t>The supplied owner's manual is available for this prototype; confirm variant fit and rights before a public demo</w:t>
+        <w:t>The supplied owner manual is approved for indexing and Q&amp;A and publicly available per the owner; edition/variant fit, display rights and the support route remain unresolved in source_manifest.json.</w:t>
       </w:r>
     </w:p>
     <w:p>
@@ -1463,7 +1451,7 @@
         <w:pStyle w:val="ListBullet"/>
       </w:pPr>
       <w:r>
-        <w:t>A public Streamlit deployment can support the selected vector storage and model endpoints at acceptable latency</w:t>
+        <w:t>A hosted Streamlit rider UI remains the planned demo; authenticated Cloud Run Qdrant and private Cloud Storage are the recorded retrieval deployment. UI latency and independent text/photo smoke tests remain pending.</w:t>
       </w:r>
     </w:p>
     <w:p>
@@ -1479,9 +1467,65 @@
         <w:t>Supporting vendor and research references are consolidated in the companion To Build document.</w:t>
       </w:r>
     </w:p>
+    <w:p>
+      <w:pPr>
+        <w:pStyle w:val="Heading1"/>
+      </w:pPr>
+      <w:r>
+        <w:rPr>
+          <w:color w:val="000000"/>
+        </w:rPr>
+        <w:t>Reviewed eligibility and response policy</w:t>
+      </w:r>
+    </w:p>
+    <w:p>
+      <w:r>
+        <w:t>The deterministic controller evaluates approved manual-derived and versioned product-policy predicates as TRUE, FALSE or UNKNOWN using typed facts and explicit units. FALSE blocks a dependent step; UNKNOWN withholds it and permits one reviewed source-derived question only if the rider can resolve the fact. An unresolved action never becomes a normal observation. Eligibility is separate from complete evidence and final claim validation. Optional models may propose observations or rank already eligible candidates; they cannot authorize actions.</w:t>
+      </w:r>
+    </w:p>
+    <w:p>
+      <w:r>
+        <w:t>Keep final statuses SUPPORTED, AMBIGUOUS, UNSUPPORTED, SAFETY_STOP and SYSTEM_ERROR distinct. A known applicable safety stop retains its verified warning even if another component fails; otherwise a required operational failure is SYSTEM_ERROR. Rider-resolvable missing facts yield AMBIGUOUS. Established source gaps, unsupported requests and exhausted paths yield UNSUPPORTED after bounded recovery, with verified OEM support. Never ask the rider to resolve missing source warnings, table headers or review decisions. SUPPORTED requires both deterministic and semantic claim validation after controller selection.</w:t>
+      </w:r>
+    </w:p>
+    <w:p>
+      <w:r>
+        <w:t>Exact reviewed paths are keyed by manual checksum, confirmed variant, intent/relevant symptoms, typed outcomes, flow/controller and policy versions, with prompt and approval dependencies. Draft, stale and mismatched entries miss closed. Changes to rules, review, dependencies or policy invalidate affected cache entries and cases. Manual checksum, parser/chunker or embedding changes create a new index version; unchanged document vectors are reused for retrieval-policy changes.</w:t>
+      </w:r>
+    </w:p>
+    <w:p>
+      <w:pPr>
+        <w:pStyle w:val="Heading1"/>
+      </w:pPr>
+      <w:r>
+        <w:rPr>
+          <w:color w:val="000000"/>
+        </w:rPr>
+        <w:t>Current hosted build and pending release</w:t>
+      </w:r>
+    </w:p>
+    <w:p>
+      <w:r>
+        <w:t>Hosted ingestion and embedding comparisons are complete. The selected BGE M3 index index_a3282c4d98cf54595e4ba168 has 532 search chunks and 277 section parents at a 1,024-token budget. Authenticated Cloud Run Qdrant serves immutable vectors from private Cloud Storage with min zero and max one instance; cold starts restore vectors without reparsing or re-embedding. The recorded backend smoke report passes 11/11 checks. Rider UI, integrated eligibility controller and gated generator remain pending; may_generate_procedural_advice stays false.</w:t>
+      </w:r>
+    </w:p>
+    <w:p>
+      <w:r>
+        <w:t>Section parents are contextual candidates. Independent review must establish procedure boundaries and approve StepDefinition, ApplicabilityRule and per-step dependency manifests against the original pages. A missing, empty, stale or unapproved dependency set cannot establish sufficiency. PDF page 103 has a flagged whole-page text/image fallback after Docling omission. Confirm year, market, variant, edition, source URL, display/hosting rights and the OEM service route before public advice.</w:t>
+      </w:r>
+    </w:p>
+    <w:p>
+      <w:r>
+        <w:t>Use dense cosine retrieval plus BM25 and RRF, initial parent/dependency assembly, source and applicability checks, at most one exact-ID recovery for approved missing dependencies, and at most one conditional cross-encoder attempt for uncertain ordering. Reassemble while retaining mandatory evidence. Missing review must not trigger reranking. Conditional is the normal policy; off and always_diagnostic are ablations. Current unreviewed bundles skip reranking and block technical generation.</w:t>
+      </w:r>
+    </w:p>
     <w:sectPr>
       <w:headerReference w:type="default" r:id="rId9"/>
       <w:footerReference w:type="default" r:id="rId10"/>
+      <w:footerReference w:type="first" r:id="rId13"/>
+      <w:footerReference w:type="even" r:id="rId14"/>
+      <w:headerReference w:type="first" r:id="rId15"/>
+      <w:headerReference w:type="even" r:id="rId16"/>
       <w:pgSz w:w="12240" w:h="15840"/>
       <w:pgMar w:top="1123" w:right="1109" w:bottom="1008" w:left="1109" w:header="720" w:footer="720" w:gutter="0"/>
       <w:cols w:space="720"/>
@@ -1503,9 +1547,29 @@
         <w:color w:val="526071"/>
         <w:sz w:val="16"/>
       </w:rPr>
-      <w:t xml:space="preserve">DRAFT • OWNER-MANUAL PILOT     |     08 OCTOBER 2026     |     </w:t>
+      <w:t xml:space="preserve">DRAFT • OWNER-MANUAL PILOT     |     09 OCTOBER 2026     |     </w:t>
     </w:r>
     <w:fldSimple w:instr="PAGE"/>
+  </w:p>
+</w:ftr>
+</file>
+
+<file path=word/footer2.xml><?xml version="1.0" encoding="utf-8"?>
+<w:ftr xmlns:m="http://schemas.openxmlformats.org/officeDocument/2006/math" xmlns:mc="http://schemas.openxmlformats.org/markup-compatibility/2006" xmlns:mo="http://schemas.microsoft.com/office/mac/office/2008/main" xmlns:mv="urn:schemas-microsoft-com:mac:vml" xmlns:o="urn:schemas-microsoft-com:office:office" xmlns:r="http://schemas.openxmlformats.org/officeDocument/2006/relationships" xmlns:v="urn:schemas-microsoft-com:vml" xmlns:w10="urn:schemas-microsoft-com:office:word" xmlns:w14="http://schemas.microsoft.com/office/word/2010/wordml" xmlns:w="http://schemas.openxmlformats.org/wordprocessingml/2006/main" xmlns:wne="http://schemas.microsoft.com/office/word/2006/wordml" xmlns:wp14="http://schemas.microsoft.com/office/word/2010/wordprocessingDrawing" xmlns:wp="http://schemas.openxmlformats.org/drawingml/2006/wordprocessingDrawing" xmlns:wpc="http://schemas.microsoft.com/office/word/2010/wordprocessingCanvas" xmlns:wpg="http://schemas.microsoft.com/office/word/2010/wordprocessingGroup" xmlns:wpi="http://schemas.microsoft.com/office/word/2010/wordprocessingInk" xmlns:wps="http://schemas.microsoft.com/office/word/2010/wordprocessingShape" mc:Ignorable="w14 wp14">
+  <w:p>
+    <w:pPr>
+      <w:pStyle w:val="Footer"/>
+    </w:pPr>
+  </w:p>
+</w:ftr>
+</file>
+
+<file path=word/footer3.xml><?xml version="1.0" encoding="utf-8"?>
+<w:ftr xmlns:m="http://schemas.openxmlformats.org/officeDocument/2006/math" xmlns:mc="http://schemas.openxmlformats.org/markup-compatibility/2006" xmlns:mo="http://schemas.microsoft.com/office/mac/office/2008/main" xmlns:mv="urn:schemas-microsoft-com:mac:vml" xmlns:o="urn:schemas-microsoft-com:office:office" xmlns:r="http://schemas.openxmlformats.org/officeDocument/2006/relationships" xmlns:v="urn:schemas-microsoft-com:vml" xmlns:w10="urn:schemas-microsoft-com:office:word" xmlns:w14="http://schemas.microsoft.com/office/word/2010/wordml" xmlns:w="http://schemas.openxmlformats.org/wordprocessingml/2006/main" xmlns:wne="http://schemas.microsoft.com/office/word/2006/wordml" xmlns:wp14="http://schemas.microsoft.com/office/word/2010/wordprocessingDrawing" xmlns:wp="http://schemas.openxmlformats.org/drawingml/2006/wordprocessingDrawing" xmlns:wpc="http://schemas.microsoft.com/office/word/2010/wordprocessingCanvas" xmlns:wpg="http://schemas.microsoft.com/office/word/2010/wordprocessingGroup" xmlns:wpi="http://schemas.microsoft.com/office/word/2010/wordprocessingInk" xmlns:wps="http://schemas.microsoft.com/office/word/2010/wordprocessingShape" mc:Ignorable="w14 wp14">
+  <w:p>
+    <w:pPr>
+      <w:pStyle w:val="Footer"/>
+    </w:pPr>
   </w:p>
 </w:ftr>
 </file>
@@ -1519,11 +1583,31 @@
     </w:pPr>
     <w:r>
       <w:rPr>
-        <w:color w:val="007F7B"/>
+        <w:color w:val="000000"/>
         <w:sz w:val="16"/>
       </w:rPr>
       <w:t>MOTOMEDIC AI   |   DESIGN PACKAGE</w:t>
     </w:r>
+  </w:p>
+</w:hdr>
+</file>
+
+<file path=word/header2.xml><?xml version="1.0" encoding="utf-8"?>
+<w:hdr xmlns:m="http://schemas.openxmlformats.org/officeDocument/2006/math" xmlns:mc="http://schemas.openxmlformats.org/markup-compatibility/2006" xmlns:mo="http://schemas.microsoft.com/office/mac/office/2008/main" xmlns:mv="urn:schemas-microsoft-com:mac:vml" xmlns:o="urn:schemas-microsoft-com:office:office" xmlns:r="http://schemas.openxmlformats.org/officeDocument/2006/relationships" xmlns:v="urn:schemas-microsoft-com:vml" xmlns:w10="urn:schemas-microsoft-com:office:word" xmlns:w14="http://schemas.microsoft.com/office/word/2010/wordml" xmlns:w="http://schemas.openxmlformats.org/wordprocessingml/2006/main" xmlns:wne="http://schemas.microsoft.com/office/word/2006/wordml" xmlns:wp14="http://schemas.microsoft.com/office/word/2010/wordprocessingDrawing" xmlns:wp="http://schemas.openxmlformats.org/drawingml/2006/wordprocessingDrawing" xmlns:wpc="http://schemas.microsoft.com/office/word/2010/wordprocessingCanvas" xmlns:wpg="http://schemas.microsoft.com/office/word/2010/wordprocessingGroup" xmlns:wpi="http://schemas.microsoft.com/office/word/2010/wordprocessingInk" xmlns:wps="http://schemas.microsoft.com/office/word/2010/wordprocessingShape" mc:Ignorable="w14 wp14">
+  <w:p>
+    <w:pPr>
+      <w:pStyle w:val="Header"/>
+    </w:pPr>
+  </w:p>
+</w:hdr>
+</file>
+
+<file path=word/header3.xml><?xml version="1.0" encoding="utf-8"?>
+<w:hdr xmlns:m="http://schemas.openxmlformats.org/officeDocument/2006/math" xmlns:mc="http://schemas.openxmlformats.org/markup-compatibility/2006" xmlns:mo="http://schemas.microsoft.com/office/mac/office/2008/main" xmlns:mv="urn:schemas-microsoft-com:mac:vml" xmlns:o="urn:schemas-microsoft-com:office:office" xmlns:r="http://schemas.openxmlformats.org/officeDocument/2006/relationships" xmlns:v="urn:schemas-microsoft-com:vml" xmlns:w10="urn:schemas-microsoft-com:office:word" xmlns:w14="http://schemas.microsoft.com/office/word/2010/wordml" xmlns:w="http://schemas.openxmlformats.org/wordprocessingml/2006/main" xmlns:wne="http://schemas.microsoft.com/office/word/2006/wordml" xmlns:wp14="http://schemas.microsoft.com/office/word/2010/wordprocessingDrawing" xmlns:wp="http://schemas.openxmlformats.org/drawingml/2006/wordprocessingDrawing" xmlns:wpc="http://schemas.microsoft.com/office/word/2010/wordprocessingCanvas" xmlns:wpg="http://schemas.microsoft.com/office/word/2010/wordprocessingGroup" xmlns:wpi="http://schemas.microsoft.com/office/word/2010/wordprocessingInk" xmlns:wps="http://schemas.microsoft.com/office/word/2010/wordprocessingShape" mc:Ignorable="w14 wp14">
+  <w:p>
+    <w:pPr>
+      <w:pStyle w:val="Header"/>
+    </w:pPr>
   </w:p>
 </w:hdr>
 </file>
@@ -1962,7 +2046,7 @@
       <w:rFonts w:asciiTheme="majorHAnsi" w:eastAsiaTheme="majorEastAsia" w:hAnsiTheme="majorHAnsi" w:cstheme="majorBidi" w:ascii="Aptos Display" w:hAnsi="Aptos Display"/>
       <w:b/>
       <w:bCs/>
-      <w:color w:val="102238"/>
+      <w:color w:val="000000"/>
       <w:sz w:val="28"/>
       <w:szCs w:val="28"/>
     </w:rPr>
@@ -1986,7 +2070,7 @@
       <w:rFonts w:asciiTheme="majorHAnsi" w:eastAsiaTheme="majorEastAsia" w:hAnsiTheme="majorHAnsi" w:cstheme="majorBidi" w:ascii="Aptos" w:hAnsi="Aptos"/>
       <w:b/>
       <w:bCs/>
-      <w:color w:val="1766A5"/>
+      <w:color w:val="000000"/>
       <w:sz w:val="23"/>
       <w:szCs w:val="26"/>
     </w:rPr>
@@ -2010,7 +2094,7 @@
       <w:rFonts w:asciiTheme="majorHAnsi" w:eastAsiaTheme="majorEastAsia" w:hAnsiTheme="majorHAnsi" w:cstheme="majorBidi" w:ascii="Aptos" w:hAnsi="Aptos"/>
       <w:b/>
       <w:bCs/>
-      <w:color w:val="007F7B"/>
+      <w:color w:val="000000"/>
       <w:sz w:val="20"/>
     </w:rPr>
   </w:style>
@@ -2243,16 +2327,13 @@
     <w:rsid w:val="00FC693F"/>
     <w:pPr>
       <w:keepNext/>
-      <w:pBdr>
-        <w:bottom w:val="single" w:sz="8" w:space="4" w:color="4F81BD" w:themeColor="accent1"/>
-      </w:pBdr>
       <w:spacing w:after="160" w:line="240" w:lineRule="auto" w:before="0"/>
       <w:contextualSpacing/>
     </w:pPr>
     <w:rPr>
       <w:rFonts w:asciiTheme="majorHAnsi" w:eastAsiaTheme="majorEastAsia" w:hAnsiTheme="majorHAnsi" w:cstheme="majorBidi" w:ascii="Aptos Display" w:hAnsi="Aptos Display"/>
       <w:b/>
-      <w:color w:val="102238"/>
+      <w:color w:val="000000"/>
       <w:spacing w:val="5"/>
       <w:kern w:val="28"/>
       <w:sz w:val="44"/>
@@ -2294,7 +2375,7 @@
       <w:b w:val="0"/>
       <w:i/>
       <w:iCs/>
-      <w:color w:val="526071"/>
+      <w:color w:val="000000"/>
       <w:spacing w:val="15"/>
       <w:sz w:val="21"/>
       <w:szCs w:val="24"/>

</xml_diff>

<commit_message>
Record open manual draft verify stream decision and reconcile planning documents
</commit_message>
<xml_diff>
--- a/01_Concept_Architecture.docx
+++ b/01_Concept_Architecture.docx
@@ -21,23 +21,95 @@
         <w:rPr>
           <w:color w:val="000000"/>
         </w:rPr>
-        <w:t>Evidence-grounded, multimodal and adaptive motorcycle troubleshooting</w:t>
+        <w:t>Manual question answering with private drafting semantic verification and buffered delivery</w:t>
       </w:r>
     </w:p>
     <w:p>
       <w:r>
-        <w:rPr>
-          <w:b/>
-          <w:color w:val="B5631D"/>
-          <w:sz w:val="17"/>
-        </w:rPr>
-        <w:t>v0.3  Refreshed 9 October 2026  Aligned to TRD v0.4</w:t>
+        <w:t>Version 04 reconciled 11 October 2026 with TRD v0.6</w:t>
       </w:r>
     </w:p>
     <w:p>
       <w:pPr/>
       <w:r>
-        <w:t>TRD v0.4 is the authoritative design and technical contract as of 9 October 2026. This document follows it. The approved owner manual governs motorcycle facts; source applicability, rights, independent review and release gates remain mandatory. Recorded implementation progress does not constitute release approval.</w:t>
+        <w:t>TRD v0.6 records the owner decision of 11 October 2026: open manual question answering through DRAFT, a separate online semantic VERIFY call, and delivery of the saved buffered response through STREAM. This supersedes A/B selection, exact-answer-only restrictions, universal StepDefinition or diagnostic-path gates, and the later no-online-verifier amendment. Source integrity, selected-manual applicability, privacy, limits and source display restrictions remain binding. This design decision does not authorize new spending, billing changes or deployment.</w:t>
+      </w:r>
+    </w:p>
+    <w:p>
+      <w:pPr>
+        <w:pStyle w:val="Heading1"/>
+      </w:pPr>
+      <w:r>
+        <w:rPr>
+          <w:color w:val="000000"/>
+        </w:rPr>
+        <w:t>Current answer architecture</w:t>
+      </w:r>
+    </w:p>
+    <w:p>
+      <w:pPr/>
+      <w:r>
+        <w:t>The rider may ask any question about the selected motorcycle and manual, including a documented procedure. No predefined question, canonical response, intent catalogue, fact group, answer scope or registered action is required for an otherwise source-supported answer. The applicable manual evidence is the knowledge authority. Give concise useful information, state partial support clearly, and provide the verified OEM support route where appropriate. Do not invent diagnosis, repairs, conditions or OEM ordering. Rider usefulness feedback does not establish technical correctness or a verified repair.</w:t>
+      </w:r>
+    </w:p>
+    <w:p>
+      <w:pPr/>
+      <w:r>
+        <w:t>Reuse versioned hosted Docling ingestion, BGE M3 plus BM25 and Qdrant. Retrieve and assemble relevant immutable passages through hybrid search, bounded recovery and conditional reranking. Do not parse or embed the manual per request. A high relevance score does not establish support; failure to retrieve an answer is not proof of absence throughout the manual.</w:t>
+      </w:r>
+    </w:p>
+    <w:p>
+      <w:pPr/>
+      <w:r>
+        <w:t>DRAFT privately using the actual question, relevant conversation history and outcomes, assembled applicable evidence and citation IDs, and the source-only policy. Produce the complete proposed answer with claim mappings, conditions, warnings and any limits. There is no separate assess-evidence-first LLM call. Allow new wording and combinations of supported facts; never expose private drafting tokens.</w:t>
+      </w:r>
+    </w:p>
+    <w:p>
+      <w:pPr/>
+      <w:r>
+        <w:t>VERIFY in a separate LLM call against the exact question, relevant history, complete proposed response, claim mappings and source passages. Check meaningful question coverage and every technical claim, including applicability, conditions, warnings, prerequisites, units and specifications. Record strict structured coverage, per-claim support, omissions, conflicts and release eligibility, bound to exact response and evidence hashes. Confidence is not acceptance. The verifier evaluates and does not rewrite an accepted answer.</w:t>
+      </w:r>
+    </w:p>
+    <w:p>
+      <w:pPr/>
+      <w:r>
+        <w:t>Finalize all server-added technical text, warnings and citations before verification. Withhold rejected drafts. Permit at most one evidence-supported correction and a new verification call; any changed response must be verified again. Verification remains probabilistic; evaluate false acceptance and false refusal independently against original pages.</w:t>
+      </w:r>
+    </w:p>
+    <w:p>
+      <w:pPr/>
+      <w:r>
+        <w:t>Show the operational labels Retrieving manual information, Drafting your answer, Checking the answer against the manual, and Displaying the verified answer when the backend actually enters each stage. Open the progress channel promptly, without chain-of-thought, fake percentages or simulated timing. Release answer content only after whole-response verification, final integrity checks and durable save. Stream the exact buffered accepted response without another model call. Bind delivery to accepted response hash, evidence and runtime versions, and operation ID; preserve complete saved answers and idempotent recovery after disconnects.</w:t>
+      </w:r>
+    </w:p>
+    <w:p>
+      <w:pPr/>
+      <w:r>
+        <w:t>Relevant typed facts and immutable outcomes remain separate from conversational wording. ACTION_COMPLETED_UNRESOLVED never becomes OBSERVED_NORMAL. Optional legacy troubleshooting flows may retain reviewed StepDefinition and ApplicabilityRule records, but they cannot restrict ordinary manual Q&amp;A or source-supported questions about documented procedures. Source-derived prerequisites and warnings must be satisfied, clarified when rider-resolvable, or explicitly handled in the verified answer.</w:t>
+      </w:r>
+    </w:p>
+    <w:p>
+      <w:pPr/>
+      <w:r>
+        <w:t>Keep SUPPORTED, AMBIGUOUS, UNSUPPORTED, SAFETY_STOP and SYSTEM_ERROR distinct. A supported partial answer states what the evidence supports and what remains unanswered. Ask one focused question only for a rider-resolvable ambiguity needed for the actual question. Source gaps or review decisions are maintainer issues. Malformed output, timeout, outage, exhausted quota or integrity failure is SYSTEM_ERROR, never acceptance or proof of absence from the manual. Preserve verified safety-stop precedence; technical safety wording is also covered by verification before delivery.</w:t>
+      </w:r>
+    </w:p>
+    <w:p>
+      <w:pPr/>
+      <w:r>
+        <w:t>Disable old Arm A and exact-response shortcuts in the initial integration; they cannot bypass the new verification call. Index reuse and provider prompt caching are separate optimizations. Future verified-response reuse needs exact source, query, state, response and runtime bindings plus separate evaluation. Similarity alone never authorizes reuse. Count complete requests and all draft, verify, correction and re-verification attempts against existing token, byte, output, concurrency, quota, retention and spending limits; never silently truncate mandatory evidence.</w:t>
+      </w:r>
+    </w:p>
+    <w:p>
+      <w:pPr/>
+      <w:r>
+        <w:t>Preserve exact immutable source IDs, original-page provenance and approved source-object bindings. Source-integrity review is distinct from authored-answer approval; the frozen 161-case v3 package and its exact bytes remain unchanged. Parent labels do not authorize whole parent bodies. Restore applicable warnings, prerequisites, table headers, units and referenced context only through reviewed source relationships. Page 103 fallback and unresolved source-specific limitations remain explicit. Rider PDF, excerpt and figure-crop delivery remains prohibited under source_manifest.json; use verified paraphrases and server-derived citation metadata.</w:t>
+      </w:r>
+    </w:p>
+    <w:p>
+      <w:pPr/>
+      <w:r>
+        <w:t>This is the current design contract, not a deployment or semantic-correctness claim. The new draft, verifier, buffered delivery and progress boundary need fresh runtime tests and independent real-output evaluation. Preserve failed prior runs. Use the currently authorized gemma-4-26b-a4b-it model unless the owner approves a change. Consult current deployment, evaluation and budget receipts; the design decision grants no new provider-spending authority.</w:t>
       </w:r>
     </w:p>
     <w:p>
@@ -58,7 +130,7 @@
     </w:p>
     <w:p>
       <w:r>
-        <w:t>Product thesis  The retrieval system locates evidence; a diagnostic state machine chooses the next eligible documented action; a fail-closed release gate prevents unsupported technical instructions from reaching the customer.</w:t>
+        <w:t>Product thesis  Retrieval locates applicable source evidence. A drafting LLM answers the actual question privately; a separate verifier evaluates question coverage and source support before the exact saved answer is streamed.</w:t>
       </w:r>
     </w:p>
     <w:p>
@@ -140,10 +212,7 @@
               <w:spacing w:after="20"/>
             </w:pPr>
             <w:r>
-              <w:rPr>
-                <w:sz w:val="16"/>
-              </w:rPr>
-              <w:t>Guided, multi-turn troubleshooting with remembered results</w:t>
+              <w:t>Open manual questions, useful partial answers and relevant multi-turn history</w:t>
             </w:r>
           </w:p>
         </w:tc>
@@ -304,6 +373,12 @@
       </w:r>
     </w:p>
     <w:p>
+      <w:pPr/>
+      <w:r>
+        <w:t>Historical flow illustration retained for provenance. This drawing predates the current draft verify stream decision; the current architecture text governs.</w:t>
+      </w:r>
+    </w:p>
+    <w:p>
       <w:pPr>
         <w:jc w:val="center"/>
       </w:pPr>
@@ -344,7 +419,7 @@
     </w:p>
     <w:p>
       <w:r>
-        <w:t>Both build and runtime are hosted. Versioned ingestion parses, chunks and embeds the approved owner manual before rider requests; runtime reuses the immutable dense/BM25 index and reviewed source relationships. Retrieval assembles candidates, bounded recovery and conditional reranking resolve retrieval uncertainty, the controller selects an eligible documented step, and deterministic plus semantic validation gates the final response. The diagrams show the target contracts; current progress is recorded below.</w:t>
+        <w:t>Both build and runtime are hosted. Versioned ingestion parses, chunks and embeds the approved manual ahead of requests. Serving reuses the immutable dense/BM25 index, reviewed source context, bounded recovery and conditional reranking, then privately drafts, separately verifies, validates, saves and streams the accepted response. Optional diagnostic paths are separate product features, not admission gates for ordinary Q&amp;A.</w:t>
       </w:r>
     </w:p>
     <w:p>
@@ -355,12 +430,18 @@
         <w:rPr>
           <w:color w:val="000000"/>
         </w:rPr>
-        <w:t>Adaptive troubleshooting: what happens after feedback?</w:t>
+        <w:t>Relevant feedback and optional legacy troubleshooting</w:t>
       </w:r>
     </w:p>
     <w:p>
       <w:r>
         <w:t>The assistant treats customer feedback as an observation, not as authorization to assume a diagnosis. “That component looked fine,” “I completed the action but the symptom remains,” and “that condition does not apply” are different structured outcomes.</w:t>
+      </w:r>
+    </w:p>
+    <w:p>
+      <w:pPr/>
+      <w:r>
+        <w:t>Historical flow illustration retained for provenance. This drawing predates the current draft verify stream decision; the current architecture text governs.</w:t>
       </w:r>
     </w:p>
     <w:p>
@@ -566,10 +647,7 @@
               <w:spacing w:after="20"/>
             </w:pPr>
             <w:r>
-              <w:rPr>
-                <w:sz w:val="16"/>
-              </w:rPr>
-              <w:t>Do not assume the component was healthy; select next permitted documented step</w:t>
+              <w:t>Preserve unresolved outcome; answer the follow-up only from applicable evidence without inferring normality or OEM order</w:t>
             </w:r>
           </w:p>
         </w:tc>
@@ -866,7 +944,7 @@
         <w:pStyle w:val="ListBullet"/>
       </w:pPr>
       <w:r>
-        <w:t>Cache guardrail: cache exact reviewed golden paths by manual checksum, variant, flow and policy version. Invalidate on any relevant change, and never use similarity alone to select a cached repair answer.</w:t>
+        <w:t>Disable old Arm A and exact-response shortcuts in the initial integration; they cannot bypass the new verification call. Index reuse and provider prompt caching are separate optimizations. Future verified-response reuse needs exact source, query, state, response and runtime bindings plus separate evaluation. Similarity alone never authorizes reuse. Count complete requests and all draft, verify, correction and re-verification attempts against existing token, byte, output, concurrency, quota, retention and spending limits; never silently truncate mandatory evidence.</w:t>
       </w:r>
     </w:p>
     <w:p>
@@ -1031,10 +1109,7 @@
               <w:spacing w:after="20"/>
             </w:pPr>
             <w:r>
-              <w:rPr>
-                <w:sz w:val="16"/>
-              </w:rPr>
-              <w:t>Guided step</w:t>
+              <w:t>Verified answer</w:t>
             </w:r>
           </w:p>
         </w:tc>
@@ -1048,10 +1123,7 @@
               <w:spacing w:after="20"/>
             </w:pPr>
             <w:r>
-              <w:rPr>
-                <w:sz w:val="16"/>
-              </w:rPr>
-              <w:t>One documented check/action at a time with page reference, warning and short explanation</w:t>
+              <w:t>Concise answer to the actual question, applicable conditions and warnings, citations, and explicit partial-support limits</w:t>
             </w:r>
           </w:p>
         </w:tc>
@@ -1128,10 +1200,7 @@
               <w:spacing w:after="20"/>
             </w:pPr>
             <w:r>
-              <w:rPr>
-                <w:sz w:val="16"/>
-              </w:rPr>
-              <w:t>A readable citation opening the PDF page/diagram/table extract</w:t>
+              <w:t>Immutable evidence ID and server-derived original page metadata; no rider PDF, excerpt or crop</w:t>
             </w:r>
           </w:p>
         </w:tc>
@@ -1285,10 +1354,7 @@
           </w:tcPr>
           <w:p>
             <w:r>
-              <w:rPr>
-                <w:sz w:val="16"/>
-              </w:rPr>
-              <w:t>Hosted index, reviewed eligibility/evidence gates, adaptive sessions, citations, text/photo, tracing and cache rejection</w:t>
+              <w:t>Hosted source retrieval, private draft, separate verifier, typed history, progress, saved buffered streaming and controls</w:t>
             </w:r>
           </w:p>
         </w:tc>
@@ -1334,10 +1400,7 @@
           </w:tcPr>
           <w:p>
             <w:r>
-              <w:rPr>
-                <w:sz w:val="16"/>
-              </w:rPr>
-              <w:t>Optional voice, OEM summary and feedback; expand approved cache coverage and reviewed relationships</w:t>
+              <w:t>Optional vision/voice and verified-response reuse only after separate evaluation</w:t>
             </w:r>
           </w:p>
         </w:tc>
@@ -1435,7 +1498,7 @@
         <w:pStyle w:val="ListBullet"/>
       </w:pPr>
       <w:r>
-        <w:t>The supplied owner manual is approved for indexing and Q&amp;A and publicly available per the owner; edition/variant fit, display rights and the support route remain unresolved in source_manifest.json.</w:t>
+        <w:t>The supplied Himalayan BS6 owner manual is the approved prototype source. Edition RAM00818/A dated 4 November 2025 and the owner-selected applicability policy are recorded in source_manifest.json. Exact source approvals remain scope-bound; market fit and redistribution rights are separate limitations. End-user PDF, excerpt and crop delivery is prohibited.</w:t>
       </w:r>
     </w:p>
     <w:p>
@@ -1475,22 +1538,22 @@
         <w:rPr>
           <w:color w:val="000000"/>
         </w:rPr>
-        <w:t>Reviewed eligibility and response policy</w:t>
+        <w:t>Source applicability conversation history and release policy</w:t>
       </w:r>
     </w:p>
     <w:p>
       <w:r>
-        <w:t>The deterministic controller evaluates approved manual-derived and versioned product-policy predicates as TRUE, FALSE or UNKNOWN using typed facts and explicit units. FALSE blocks a dependent step; UNKNOWN withholds it and permits one reviewed source-derived question only if the rider can resolve the fact. An unresolved action never becomes a normal observation. Eligibility is separate from complete evidence and final claim validation. Optional models may propose observations or rank already eligible candidates; they cannot authorize actions.</w:t>
+        <w:t>Relevant typed facts and immutable outcomes remain separate from conversational wording. ACTION_COMPLETED_UNRESOLVED never becomes OBSERVED_NORMAL. Optional legacy troubleshooting flows may retain reviewed StepDefinition and ApplicabilityRule records, but they cannot restrict ordinary manual Q&amp;A or source-supported questions about documented procedures. Source-derived prerequisites and warnings must be satisfied, clarified when rider-resolvable, or explicitly handled in the verified answer.</w:t>
       </w:r>
     </w:p>
     <w:p>
       <w:r>
-        <w:t>Keep final statuses SUPPORTED, AMBIGUOUS, UNSUPPORTED, SAFETY_STOP and SYSTEM_ERROR distinct. A known applicable safety stop retains its verified warning even if another component fails; otherwise a required operational failure is SYSTEM_ERROR. Rider-resolvable missing facts yield AMBIGUOUS. Established source gaps, unsupported requests and exhausted paths yield UNSUPPORTED after bounded recovery, with verified OEM support. Never ask the rider to resolve missing source warnings, table headers or review decisions. SUPPORTED requires both deterministic and semantic claim validation after controller selection.</w:t>
+        <w:t>Keep SUPPORTED, AMBIGUOUS, UNSUPPORTED, SAFETY_STOP and SYSTEM_ERROR distinct. A supported partial answer states what the evidence supports and what remains unanswered. Ask one focused question only for a rider-resolvable ambiguity needed for the actual question. Source gaps or review decisions are maintainer issues. Malformed output, timeout, outage, exhausted quota or integrity failure is SYSTEM_ERROR, never acceptance or proof of absence from the manual. Preserve verified safety-stop precedence; technical safety wording is also covered by verification before delivery.</w:t>
       </w:r>
     </w:p>
     <w:p>
       <w:r>
-        <w:t>Exact reviewed paths are keyed by manual checksum, confirmed variant, intent/relevant symptoms, typed outcomes, flow/controller and policy versions, with prompt and approval dependencies. Draft, stale and mismatched entries miss closed. Changes to rules, review, dependencies or policy invalidate affected cache entries and cases. Manual checksum, parser/chunker or embedding changes create a new index version; unchanged document vectors are reused for retrieval-policy changes.</w:t>
+        <w:t>Disable old Arm A and exact-response shortcuts in the initial integration; they cannot bypass the new verification call. Index reuse and provider prompt caching are separate optimizations. Future verified-response reuse needs exact source, query, state, response and runtime bindings plus separate evaluation. Similarity alone never authorizes reuse. Count complete requests and all draft, verify, correction and re-verification attempts against existing token, byte, output, concurrency, quota, retention and spending limits; never silently truncate mandatory evidence.</w:t>
       </w:r>
     </w:p>
     <w:p>
@@ -1506,12 +1569,12 @@
     </w:p>
     <w:p>
       <w:r>
-        <w:t>Hosted ingestion and embedding comparisons are complete. The selected BGE M3 index index_a3282c4d98cf54595e4ba168 has 532 search chunks and 277 section parents at a 1,024-token budget. Authenticated Cloud Run Qdrant serves immutable vectors from private Cloud Storage with min zero and max one instance; cold starts restore vectors without reparsing or re-embedding. The recorded backend smoke report passes 11/11 checks. Rider UI, integrated eligibility controller and gated generator remain pending; may_generate_procedural_advice stays false.</w:t>
+        <w:t>Hosted ingestion and embedding comparisons are complete. Candidate index index_a3282c4d98cf54595e4ba168 has 532 search chunks and 277 section parents at a 1,024-token budget. Private Cloud Run Qdrant restores stored immutable vectors on cold start, without reparsing or re-embedding. Historical backend smoke passed 11/11. These results do not validate the new draft verify stream pipeline or public release.</w:t>
       </w:r>
     </w:p>
     <w:p>
       <w:r>
-        <w:t>Section parents are contextual candidates. Independent review must establish procedure boundaries and approve StepDefinition, ApplicabilityRule and per-step dependency manifests against the original pages. A missing, empty, stale or unapproved dependency set cannot establish sufficiency. PDF page 103 has a flagged whole-page text/image fallback after Docling omission. Confirm year, market, variant, edition, source URL, display/hosting rights and the OEM service route before public advice.</w:t>
+        <w:t>Preserve exact immutable source IDs, original-page provenance and approved source-object bindings. Source-integrity review is distinct from authored-answer approval; the frozen 161-case v3 package and its exact bytes remain unchanged. Parent labels do not authorize whole parent bodies. Restore applicable warnings, prerequisites, table headers, units and referenced context only through reviewed source relationships. Page 103 fallback and unresolved source-specific limitations remain explicit. Rider PDF, excerpt and figure-crop delivery remains prohibited under source_manifest.json; use verified paraphrases and server-derived citation metadata.</w:t>
       </w:r>
     </w:p>
     <w:p>
@@ -2120,7 +2183,7 @@
       <w:bCs/>
       <w:i/>
       <w:iCs/>
-      <w:color w:val="4F81BD" w:themeColor="accent1"/>
+      <w:color w:val="000000"/>
     </w:rPr>
   </w:style>
   <w:style w:type="paragraph" w:styleId="Heading5">
@@ -2141,7 +2204,7 @@
     </w:pPr>
     <w:rPr>
       <w:rFonts w:asciiTheme="majorHAnsi" w:eastAsiaTheme="majorEastAsia" w:hAnsiTheme="majorHAnsi" w:cstheme="majorBidi"/>
-      <w:color w:val="243F60" w:themeColor="accent1" w:themeShade="7F"/>
+      <w:color w:val="000000"/>
     </w:rPr>
   </w:style>
   <w:style w:type="paragraph" w:styleId="Heading6">
@@ -2164,7 +2227,7 @@
       <w:rFonts w:asciiTheme="majorHAnsi" w:eastAsiaTheme="majorEastAsia" w:hAnsiTheme="majorHAnsi" w:cstheme="majorBidi"/>
       <w:i/>
       <w:iCs/>
-      <w:color w:val="243F60" w:themeColor="accent1" w:themeShade="7F"/>
+      <w:color w:val="000000"/>
     </w:rPr>
   </w:style>
   <w:style w:type="paragraph" w:styleId="Heading7">
@@ -2187,7 +2250,7 @@
       <w:rFonts w:asciiTheme="majorHAnsi" w:eastAsiaTheme="majorEastAsia" w:hAnsiTheme="majorHAnsi" w:cstheme="majorBidi"/>
       <w:i/>
       <w:iCs/>
-      <w:color w:val="404040" w:themeColor="text1" w:themeTint="BF"/>
+      <w:color w:val="000000"/>
     </w:rPr>
   </w:style>
   <w:style w:type="paragraph" w:styleId="Heading8">
@@ -2208,7 +2271,7 @@
     </w:pPr>
     <w:rPr>
       <w:rFonts w:asciiTheme="majorHAnsi" w:eastAsiaTheme="majorEastAsia" w:hAnsiTheme="majorHAnsi" w:cstheme="majorBidi"/>
-      <w:color w:val="4F81BD" w:themeColor="accent1"/>
+      <w:color w:val="000000"/>
       <w:sz w:val="20"/>
       <w:szCs w:val="20"/>
     </w:rPr>
@@ -2233,7 +2296,7 @@
       <w:rFonts w:asciiTheme="majorHAnsi" w:eastAsiaTheme="majorEastAsia" w:hAnsiTheme="majorHAnsi" w:cstheme="majorBidi"/>
       <w:i/>
       <w:iCs/>
-      <w:color w:val="404040" w:themeColor="text1" w:themeTint="BF"/>
+      <w:color w:val="000000"/>
       <w:sz w:val="20"/>
       <w:szCs w:val="20"/>
     </w:rPr>
@@ -2284,7 +2347,7 @@
       <w:rFonts w:asciiTheme="majorHAnsi" w:eastAsiaTheme="majorEastAsia" w:hAnsiTheme="majorHAnsi" w:cstheme="majorBidi"/>
       <w:b/>
       <w:bCs/>
-      <w:color w:val="365F91" w:themeColor="accent1" w:themeShade="BF"/>
+      <w:color w:val="000000"/>
       <w:sz w:val="28"/>
       <w:szCs w:val="28"/>
     </w:rPr>
@@ -2299,7 +2362,7 @@
       <w:rFonts w:asciiTheme="majorHAnsi" w:eastAsiaTheme="majorEastAsia" w:hAnsiTheme="majorHAnsi" w:cstheme="majorBidi"/>
       <w:b/>
       <w:bCs/>
-      <w:color w:val="4F81BD" w:themeColor="accent1"/>
+      <w:color w:val="000000"/>
       <w:sz w:val="26"/>
       <w:szCs w:val="26"/>
     </w:rPr>
@@ -2314,7 +2377,7 @@
       <w:rFonts w:asciiTheme="majorHAnsi" w:eastAsiaTheme="majorEastAsia" w:hAnsiTheme="majorHAnsi" w:cstheme="majorBidi"/>
       <w:b/>
       <w:bCs/>
-      <w:color w:val="4F81BD" w:themeColor="accent1"/>
+      <w:color w:val="000000"/>
     </w:rPr>
   </w:style>
   <w:style w:type="paragraph" w:styleId="Title">
@@ -2701,7 +2764,7 @@
       <w:bCs/>
       <w:i/>
       <w:iCs/>
-      <w:color w:val="4F81BD" w:themeColor="accent1"/>
+      <w:color w:val="000000"/>
     </w:rPr>
   </w:style>
   <w:style w:type="character" w:customStyle="1" w:styleId="Heading5Char">
@@ -2713,7 +2776,7 @@
     <w:rsid w:val="00FC693F"/>
     <w:rPr>
       <w:rFonts w:asciiTheme="majorHAnsi" w:eastAsiaTheme="majorEastAsia" w:hAnsiTheme="majorHAnsi" w:cstheme="majorBidi"/>
-      <w:color w:val="243F60" w:themeColor="accent1" w:themeShade="7F"/>
+      <w:color w:val="000000"/>
     </w:rPr>
   </w:style>
   <w:style w:type="character" w:customStyle="1" w:styleId="Heading6Char">
@@ -2727,7 +2790,7 @@
       <w:rFonts w:asciiTheme="majorHAnsi" w:eastAsiaTheme="majorEastAsia" w:hAnsiTheme="majorHAnsi" w:cstheme="majorBidi"/>
       <w:i/>
       <w:iCs/>
-      <w:color w:val="243F60" w:themeColor="accent1" w:themeShade="7F"/>
+      <w:color w:val="000000"/>
     </w:rPr>
   </w:style>
   <w:style w:type="character" w:customStyle="1" w:styleId="Heading7Char">
@@ -2741,7 +2804,7 @@
       <w:rFonts w:asciiTheme="majorHAnsi" w:eastAsiaTheme="majorEastAsia" w:hAnsiTheme="majorHAnsi" w:cstheme="majorBidi"/>
       <w:i/>
       <w:iCs/>
-      <w:color w:val="404040" w:themeColor="text1" w:themeTint="BF"/>
+      <w:color w:val="000000"/>
     </w:rPr>
   </w:style>
   <w:style w:type="character" w:customStyle="1" w:styleId="Heading8Char">
@@ -2753,7 +2816,7 @@
     <w:rsid w:val="00FC693F"/>
     <w:rPr>
       <w:rFonts w:asciiTheme="majorHAnsi" w:eastAsiaTheme="majorEastAsia" w:hAnsiTheme="majorHAnsi" w:cstheme="majorBidi"/>
-      <w:color w:val="4F81BD" w:themeColor="accent1"/>
+      <w:color w:val="000000"/>
       <w:sz w:val="20"/>
       <w:szCs w:val="20"/>
     </w:rPr>
@@ -2769,7 +2832,7 @@
       <w:rFonts w:asciiTheme="majorHAnsi" w:eastAsiaTheme="majorEastAsia" w:hAnsiTheme="majorHAnsi" w:cstheme="majorBidi"/>
       <w:i/>
       <w:iCs/>
-      <w:color w:val="404040" w:themeColor="text1" w:themeTint="BF"/>
+      <w:color w:val="000000"/>
       <w:sz w:val="20"/>
       <w:szCs w:val="20"/>
     </w:rPr>

</xml_diff>

<commit_message>
Clarify release decisions and exact application fallback in planning documents
</commit_message>
<xml_diff>
--- a/01_Concept_Architecture.docx
+++ b/01_Concept_Architecture.docx
@@ -67,19 +67,19 @@
     <w:p>
       <w:pPr/>
       <w:r>
-        <w:t>VERIFY in a separate LLM call against the exact question, relevant history, complete proposed response, claim mappings and source passages. Check meaningful question coverage and every technical claim, including applicability, conditions, warnings, prerequisites, units and specifications. Record strict structured coverage, per-claim support, omissions, conflicts and release eligibility, bound to exact response and evidence hashes. Confidence is not acceptance. The verifier evaluates and does not rewrite an accepted answer.</w:t>
+        <w:t>VERIFY in a separate LLM call against the exact question, relevant history, complete proposed response, claim mappings and source passages. Check meaningful question coverage and every technical claim, including applicability, conditions, warnings, prerequisites, units and specifications. Record strict structured question coverage, per-claim support, omissions, conflicts and an ordinary decision of RELEASE_COMPLETE, RELEASE_PARTIAL or SHOW_FALLBACK, bound to exact response and evidence hashes. Preserve RELEASE_CLARIFICATION for AMBIGUOUS and RELEASE_SAFETY_STOP for SAFETY_STOP special routing. Confidence is not acceptance. The verifier evaluates and does not rewrite a released answer.</w:t>
       </w:r>
     </w:p>
     <w:p>
       <w:pPr/>
       <w:r>
-        <w:t>Finalize all server-added technical text, warnings and citations before verification. Withhold rejected drafts. Permit at most one evidence-supported correction and a new verification call; any changed response must be verified again. Verification remains probabilistic; evaluate false acceptance and false refusal independently against original pages.</w:t>
+        <w:t>Finalize all server-added technical text, warnings, citations and any partial-answer limitation before verification. Withhold rejected drafts. Permit at most one evidence-supported correction and a new verification call; any changed technical response must be verified again. If support cannot be established or the bounded correction fails, use SHOW_FALLBACK without another correction. Verification remains probabilistic; evaluate false acceptance and false refusal independently against original pages.</w:t>
       </w:r>
     </w:p>
     <w:p>
       <w:pPr/>
       <w:r>
-        <w:t>Show the operational labels Retrieving manual information, Drafting your answer, Checking the answer against the manual, and Displaying the verified answer when the backend actually enters each stage. Open the progress channel promptly, without chain-of-thought, fake percentages or simulated timing. Release answer content only after whole-response verification, final integrity checks and durable save. Stream the exact buffered accepted response without another model call. Bind delivery to accepted response hash, evidence and runtime versions, and operation ID; preserve complete saved answers and idempotent recovery after disconnects.</w:t>
+        <w:t>Show the operational labels Retrieving manual information, Drafting your answer, Checking the answer against the manual, and Displaying the verified answer when the backend actually enters each stage. Open the progress channel promptly, without chain-of-thought, fake percentages or simulated timing. Release technical answer content only after whole-response verification, final integrity checks and durable save. Stream the exact buffered verified response without another model call. Bind delivery to response hash, evidence and runtime versions, and operation ID; preserve complete saved answers and idempotent recovery after disconnects. Fixed neutral fallback and system-error messages do not need successful LLM verification; never label their display as a verified technical answer.</w:t>
       </w:r>
     </w:p>
     <w:p>
@@ -91,7 +91,13 @@
     <w:p>
       <w:pPr/>
       <w:r>
-        <w:t>Keep SUPPORTED, AMBIGUOUS, UNSUPPORTED, SAFETY_STOP and SYSTEM_ERROR distinct. A supported partial answer states what the evidence supports and what remains unanswered. Ask one focused question only for a rider-resolvable ambiguity needed for the actual question. Source gaps or review decisions are maintainer issues. Malformed output, timeout, outage, exhausted quota or integrity failure is SYSTEM_ERROR, never acceptance or proof of absence from the manual. Preserve verified safety-stop precedence; technical safety wording is also covered by verification before delivery.</w:t>
+        <w:t>The ordinary verifier decisions are exactly RELEASE_COMPLETE, RELEASE_PARTIAL and SHOW_FALLBACK. These decision labels are distinct from the application states SUPPORTED, AMBIGUOUS, UNSUPPORTED, SAFETY_STOP and SYSTEM_ERROR; do not introduce ACCEPTED or PARTIAL as verdict labels. RELEASE_COMPLETE and RELEASE_PARTIAL release only the exact verified technical response; a partial response must include its limitation before verification. SHOW_FALLBACK handles irrelevant evidence, missing support or failed bounded correction, while preserving RELEASE_CLARIFICATION for AMBIGUOUS and RELEASE_SAFETY_STOP for SAFETY_STOP as distinct special decisions. Ask one focused question only for a rider-resolvable ambiguity needed for the actual question. Source gaps or review decisions are maintainer issues. Malformed output, timeout, outage, exhausted quota or integrity failure is SYSTEM_ERROR, never acceptance or proof of absence throughout the manual. Preserve safety-stop precedence; technical safety wording is also covered by verification before delivery.</w:t>
+      </w:r>
+    </w:p>
+    <w:p>
+      <w:pPr/>
+      <w:r>
+        <w:t>For SHOW_FALLBACK, display this exact fixed application message: I couldn’t find relevant information in the selected manual to answer your question. Please contact Royal Enfield or an authorised service centre. Attach the verified OEM contact URI from source_manifest.json, preserving its manifest binding. Record the exact internal reason code IRRELEVANT_ANSWER, MISSING_SUPPORT or CORRECTION_UNSUCCESSFUL. Preserve specific provider, schema and source-integrity failure reason codes in telemetry while displaying the fixed neutral SYSTEM_ERROR message. This fallback is neutral application wording, not a verified technical answer. For SYSTEM_ERROR, display this exact fixed application message: I couldn’t check the answer right now. Please try again shortly. These fixed neutral messages require no successful LLM generation or verification call and remain available during provider failure. Do not expose rejected technical drafts or claim these messages received semantic technical approval. Preserve application routing, safety precedence, session ownership and saved delivery integrity.</w:t>
       </w:r>
     </w:p>
     <w:p>
@@ -1548,7 +1554,7 @@
     </w:p>
     <w:p>
       <w:r>
-        <w:t>Keep SUPPORTED, AMBIGUOUS, UNSUPPORTED, SAFETY_STOP and SYSTEM_ERROR distinct. A supported partial answer states what the evidence supports and what remains unanswered. Ask one focused question only for a rider-resolvable ambiguity needed for the actual question. Source gaps or review decisions are maintainer issues. Malformed output, timeout, outage, exhausted quota or integrity failure is SYSTEM_ERROR, never acceptance or proof of absence from the manual. Preserve verified safety-stop precedence; technical safety wording is also covered by verification before delivery.</w:t>
+        <w:t>The ordinary verifier decisions are exactly RELEASE_COMPLETE, RELEASE_PARTIAL and SHOW_FALLBACK. These decision labels are distinct from the application states SUPPORTED, AMBIGUOUS, UNSUPPORTED, SAFETY_STOP and SYSTEM_ERROR; do not introduce ACCEPTED or PARTIAL as verdict labels. RELEASE_COMPLETE and RELEASE_PARTIAL release only the exact verified technical response; a partial response must include its limitation before verification. SHOW_FALLBACK handles irrelevant evidence, missing support or failed bounded correction, while preserving RELEASE_CLARIFICATION for AMBIGUOUS and RELEASE_SAFETY_STOP for SAFETY_STOP as distinct special decisions. Ask one focused question only for a rider-resolvable ambiguity needed for the actual question. Source gaps or review decisions are maintainer issues. Malformed output, timeout, outage, exhausted quota or integrity failure is SYSTEM_ERROR, never acceptance or proof of absence throughout the manual. Preserve safety-stop precedence; technical safety wording is also covered by verification before delivery.</w:t>
       </w:r>
     </w:p>
     <w:p>

</xml_diff>

<commit_message>
Repair draft verify stream document layout and revision labels
</commit_message>
<xml_diff>
--- a/01_Concept_Architecture.docx
+++ b/01_Concept_Architecture.docx
@@ -170,6 +170,7 @@
       <w:tr>
         <w:trPr>
           <w:tblHeader/>
+          <w:cantSplit/>
         </w:trPr>
         <w:tc>
           <w:tcPr>
@@ -218,6 +219,9 @@
               <w:spacing w:after="20"/>
             </w:pPr>
             <w:r>
+              <w:rPr>
+                <w:sz w:val="16"/>
+              </w:rPr>
               <w:t>Open manual questions, useful partial answers and relevant multi-turn history</w:t>
             </w:r>
           </w:p>
@@ -379,13 +383,17 @@
       </w:r>
     </w:p>
     <w:p>
-      <w:pPr/>
+      <w:pPr>
+        <w:keepNext/>
+        <w:keepLines/>
+      </w:pPr>
       <w:r>
         <w:t>Historical flow illustration retained for provenance. This drawing predates the current draft verify stream decision; the current architecture text governs.</w:t>
       </w:r>
     </w:p>
     <w:p>
       <w:pPr>
+        <w:keepLines/>
         <w:jc w:val="center"/>
       </w:pPr>
       <w:r>
@@ -445,13 +453,17 @@
       </w:r>
     </w:p>
     <w:p>
-      <w:pPr/>
+      <w:pPr>
+        <w:keepNext/>
+        <w:keepLines/>
+      </w:pPr>
       <w:r>
         <w:t>Historical flow illustration retained for provenance. This drawing predates the current draft verify stream decision; the current architecture text governs.</w:t>
       </w:r>
     </w:p>
     <w:p>
       <w:pPr>
+        <w:keepLines/>
         <w:jc w:val="center"/>
       </w:pPr>
       <w:r>
@@ -505,6 +517,7 @@
       <w:tr>
         <w:trPr>
           <w:tblHeader/>
+          <w:cantSplit/>
         </w:trPr>
         <w:tc>
           <w:tcPr>
@@ -653,6 +666,9 @@
               <w:spacing w:after="20"/>
             </w:pPr>
             <w:r>
+              <w:rPr>
+                <w:sz w:val="16"/>
+              </w:rPr>
               <w:t>Preserve unresolved outcome; answer the follow-up only from applicable evidence without inferring normality or OEM order</w:t>
             </w:r>
           </w:p>
@@ -987,6 +1003,7 @@
       <w:tr>
         <w:trPr>
           <w:tblHeader/>
+          <w:cantSplit/>
         </w:trPr>
         <w:tc>
           <w:tcPr>
@@ -1115,6 +1132,9 @@
               <w:spacing w:after="20"/>
             </w:pPr>
             <w:r>
+              <w:rPr>
+                <w:sz w:val="16"/>
+              </w:rPr>
               <w:t>Verified answer</w:t>
             </w:r>
           </w:p>
@@ -1129,6 +1149,9 @@
               <w:spacing w:after="20"/>
             </w:pPr>
             <w:r>
+              <w:rPr>
+                <w:sz w:val="16"/>
+              </w:rPr>
               <w:t>Concise answer to the actual question, applicable conditions and warnings, citations, and explicit partial-support limits</w:t>
             </w:r>
           </w:p>
@@ -1206,6 +1229,9 @@
               <w:spacing w:after="20"/>
             </w:pPr>
             <w:r>
+              <w:rPr>
+                <w:sz w:val="16"/>
+              </w:rPr>
               <w:t>Immutable evidence ID and server-derived original page metadata; no rider PDF, excerpt or crop</w:t>
             </w:r>
           </w:p>
@@ -1285,6 +1311,7 @@
       <w:tr>
         <w:trPr>
           <w:tblHeader/>
+          <w:cantSplit/>
         </w:trPr>
         <w:tc>
           <w:tcPr>
@@ -1360,6 +1387,9 @@
           </w:tcPr>
           <w:p>
             <w:r>
+              <w:rPr>
+                <w:sz w:val="16"/>
+              </w:rPr>
               <w:t>Hosted source retrieval, private draft, separate verifier, typed history, progress, saved buffered streaming and controls</w:t>
             </w:r>
           </w:p>
@@ -1406,6 +1436,9 @@
           </w:tcPr>
           <w:p>
             <w:r>
+              <w:rPr>
+                <w:sz w:val="16"/>
+              </w:rPr>
               <w:t>Optional vision/voice and verified-response reuse only after separate evaluation</w:t>
             </w:r>
           </w:p>
@@ -1616,7 +1649,7 @@
         <w:color w:val="526071"/>
         <w:sz w:val="16"/>
       </w:rPr>
-      <w:t xml:space="preserve">DRAFT • OWNER-MANUAL PILOT     |     09 OCTOBER 2026     |     </w:t>
+      <w:t xml:space="preserve">TRD v0.6 | DRAFT VERIFY STREAM | 11 OCTOBER 2026 | </w:t>
     </w:r>
     <w:fldSimple w:instr="PAGE"/>
   </w:p>
@@ -1629,6 +1662,13 @@
     <w:pPr>
       <w:pStyle w:val="Footer"/>
     </w:pPr>
+    <w:r>
+      <w:rPr>
+        <w:sz w:val="16"/>
+      </w:rPr>
+      <w:t xml:space="preserve">TRD v0.6 | DRAFT VERIFY STREAM | 11 OCTOBER 2026 | </w:t>
+    </w:r>
+    <w:fldSimple w:instr="PAGE"/>
   </w:p>
 </w:ftr>
 </file>
@@ -1639,6 +1679,13 @@
     <w:pPr>
       <w:pStyle w:val="Footer"/>
     </w:pPr>
+    <w:r>
+      <w:rPr>
+        <w:sz w:val="16"/>
+      </w:rPr>
+      <w:t xml:space="preserve">TRD v0.6 | DRAFT VERIFY STREAM | 11 OCTOBER 2026 | </w:t>
+    </w:r>
+    <w:fldSimple w:instr="PAGE"/>
   </w:p>
 </w:ftr>
 </file>

</xml_diff>

<commit_message>
Normalize planning document footer variants for complete revision labels
</commit_message>
<xml_diff>
--- a/01_Concept_Architecture.docx
+++ b/01_Concept_Architecture.docx
@@ -1642,16 +1642,23 @@
   <w:p>
     <w:pPr>
       <w:pStyle w:val="Footer"/>
+      <w:ind w:left="0" w:right="0"/>
       <w:jc w:val="right"/>
     </w:pPr>
     <w:r>
       <w:rPr>
-        <w:color w:val="526071"/>
         <w:sz w:val="16"/>
       </w:rPr>
       <w:t xml:space="preserve">TRD v0.6 | DRAFT VERIFY STREAM | 11 OCTOBER 2026 | </w:t>
     </w:r>
-    <w:fldSimple w:instr="PAGE"/>
+    <w:fldSimple w:instr="PAGE">
+      <w:r>
+        <w:rPr>
+          <w:sz w:val="16"/>
+        </w:rPr>
+        <w:t>1</w:t>
+      </w:r>
+    </w:fldSimple>
   </w:p>
 </w:ftr>
 </file>
@@ -1661,6 +1668,8 @@
   <w:p>
     <w:pPr>
       <w:pStyle w:val="Footer"/>
+      <w:ind w:left="0" w:right="0"/>
+      <w:jc w:val="right"/>
     </w:pPr>
     <w:r>
       <w:rPr>
@@ -1668,7 +1677,14 @@
       </w:rPr>
       <w:t xml:space="preserve">TRD v0.6 | DRAFT VERIFY STREAM | 11 OCTOBER 2026 | </w:t>
     </w:r>
-    <w:fldSimple w:instr="PAGE"/>
+    <w:fldSimple w:instr="PAGE">
+      <w:r>
+        <w:rPr>
+          <w:sz w:val="16"/>
+        </w:rPr>
+        <w:t>1</w:t>
+      </w:r>
+    </w:fldSimple>
   </w:p>
 </w:ftr>
 </file>
@@ -1678,6 +1694,8 @@
   <w:p>
     <w:pPr>
       <w:pStyle w:val="Footer"/>
+      <w:ind w:left="0" w:right="0"/>
+      <w:jc w:val="right"/>
     </w:pPr>
     <w:r>
       <w:rPr>
@@ -1685,7 +1703,14 @@
       </w:rPr>
       <w:t xml:space="preserve">TRD v0.6 | DRAFT VERIFY STREAM | 11 OCTOBER 2026 | </w:t>
     </w:r>
-    <w:fldSimple w:instr="PAGE"/>
+    <w:fldSimple w:instr="PAGE">
+      <w:r>
+        <w:rPr>
+          <w:sz w:val="16"/>
+        </w:rPr>
+        <w:t>1</w:t>
+      </w:r>
+    </w:fldSimple>
   </w:p>
 </w:ftr>
 </file>

</xml_diff>